<commit_message>
feat: harmonisation des parcours pédagogiques
</commit_message>
<xml_diff>
--- a/livrables-IGPDE-2026-102846/Livrables-Formateur/documents-administratifs-igpde/Derped-deroule-pedagogique-102846-v2.docx
+++ b/livrables-IGPDE-2026-102846/Livrables-Formateur/documents-administratifs-igpde/Derped-deroule-pedagogique-102846-v2.docx
@@ -1326,7 +1326,7 @@
                 <w:sz w:val="18"/>
                 <w:lang w:bidi="ar-SA"/>
               </w:rPr>
-              <w:t>Support officiel, slides 1 à 14 ; projection : 00-introduction-et-idees-recues.pptx ; salle équipée d'ordinateurs.</w:t>
+              <w:t>Support officiel, slides 1 à 14 ; projection : 00-introduction-et-idees-recues.pptx, slides 1 à 14 ; salle équipée d'ordinateurs.</w:t>
             </w:r>
           </w:p>
         </w:tc>
@@ -1535,7 +1535,7 @@
                 <w:sz w:val="18"/>
                 <w:lang w:bidi="ar-SA"/>
               </w:rPr>
-              <w:t>Support officiel, slides 15 à 53 ; projection : 01-accessibilite-numerique-et-cadre-legal.pptx ; exemples de déclarations d'accessibilité, simulateur Obligally en ligne et guide Accessibiliser sa communication.</w:t>
+              <w:t>Support officiel, slides 15 à 53 ; projection : 01-accessibilite-numerique-et-cadre-legal.pptx, slides 1 à 39 ; exemples de déclarations d'accessibilité, simulateur Obligally en ligne et guide Accessibiliser sa communication.</w:t>
             </w:r>
           </w:p>
         </w:tc>
@@ -1847,7 +1847,7 @@
                 <w:kern w:val="0"/>
                 <w:lang w:bidi="ar-SA"/>
               </w:rPr>
-              <w:t>Identifier et corriger les obstacles d’accessibilité dans le guide Word de Sami. Appliquer une méthode par stations, vérifier le DOCX, exporter un PDF balisé et contrôler le résultat.</w:t>
+              <w:t>Identifier et corriger les obstacles d’accessibilité dans le guide Word de Sami. Appliquer une méthode en cinq étapes, vérifier le DOCX, exporter un PDF balisé et contrôler le résultat.</w:t>
               <w:br/>
               <w:t>[Bloom : appliquer, évaluer]</w:t>
             </w:r>
@@ -1881,7 +1881,7 @@
                 <w:kern w:val="0"/>
                 <w:lang w:bidi="ar-SA"/>
               </w:rPr>
-              <w:t>Démonstration lecteur d’écran et quiz diagnostic A/B. TP guidé en cinq stations : structurer et naviguer ; contenus et liens ; couleurs, graphiques et tableaux ; langues et lisibilité ; finaliser et publier. Checklist progressive, vérificateur Word, export PDF balisé, contrôle avec PAC ou Acrobat Pro et vérification humaine.</w:t>
+              <w:t>Démonstration lecteur d’écran et quiz diagnostic A/B. TP guidé en cinq étapes : structurer et naviguer ; contenus et liens ; couleurs, graphiques et tableaux ; langues et lisibilité ; finaliser, vérifier, exporter et contrôler. Checklist progressive, vérificateur Word, export PDF balisé, contrôle avec PAC ou Acrobat Pro et vérification humaine.</w:t>
             </w:r>
           </w:p>
         </w:tc>
@@ -1913,7 +1913,7 @@
                 <w:kern w:val="0"/>
                 <w:lang w:bidi="ar-SA"/>
               </w:rPr>
-              <w:t>Démonstration lecteur d’écran, quiz diagnostic, TP guidé sur le document de Sami, travail en binômes, checklist renseignée après chaque station, synthèses techniques au fil de l’eau et remise finale du corrigé de référence.</w:t>
+              <w:t>Démonstration lecteur d’écran, quiz diagnostic, TP guidé sur le document de Sami, travail en binômes, checklist renseignée après chaque étape, synthèses techniques au fil de l’eau et remise finale du corrigé de référence.</w:t>
             </w:r>
           </w:p>
         </w:tc>
@@ -1945,7 +1945,7 @@
                 <w:kern w:val="0"/>
                 <w:lang w:bidi="ar-SA"/>
               </w:rPr>
-              <w:t>Support officiel, slides 54 à 79 ; projection : 02-documents-bureautiques-accessibles-tp.pptx ; un DOCX de départ au choix, checklist DOCX ou papier, cartes WCAG, mémos Word et Writer, vérificateur Word, PAC ou Acrobat Pro et casque audio.</w:t>
+              <w:t>Support officiel, slides 54 à 79 ; projection : 02-documents-bureautiques-accessibles-tp.pptx, slides 1 à 26 ; un DOCX de départ au choix, checklist DOCX ou papier, cartes WCAG, mémos Word et Writer, vérificateur Word, PAC ou Acrobat Pro et casque audio.</w:t>
             </w:r>
           </w:p>
         </w:tc>
@@ -2151,7 +2151,7 @@
                 <w:kern w:val="0"/>
                 <w:lang w:bidi="ar-SA"/>
               </w:rPr>
-              <w:t>Support officiel, slide 80 ; checklist renseignée, DOCX corrigé et PDF contrôlé.</w:t>
+              <w:t>Support officiel, slide 80 ; projection : 02-documents-bureautiques-accessibles-tp.pptx, slide 27 ; checklist renseignée, DOCX corrigé et PDF contrôlé.</w:t>
             </w:r>
           </w:p>
         </w:tc>
@@ -2865,7 +2865,7 @@
                 <w:kern w:val="0"/>
                 <w:lang w:bidi="ar-SA"/>
               </w:rPr>
-              <w:t>Support officiel, slides 81 à 111 ; projection : 03-web-accessible-tp.pptx ; site d’exercice Easy Checks, grille XLSX, navigateur Firefox ou Edge, outils de contraste et extensions HeadingsMap et Web Developer.</w:t>
+              <w:t>Support officiel, slides 81 à 111 ; projection : 03-web-accessible-tp.pptx, slides 1 à 30 ; site d’exercice Easy Checks, grille XLSX, navigateur Firefox ou Edge, outils de contraste et extensions HeadingsMap et Web Developer.</w:t>
             </w:r>
           </w:p>
         </w:tc>
@@ -3278,7 +3278,7 @@
                 <w:kern w:val="0"/>
                 <w:lang w:bidi="ar-SA"/>
               </w:rPr>
-              <w:t>Support officiel, slides 112 à 132 ; projection : 04-reseaux-sociaux-accessibles.pptx ; exemples de publications et checklist réseaux sociaux en trois volets.</w:t>
+              <w:t>Support officiel, slides 112 à 132 ; projection : 04-reseaux-sociaux-accessibles.pptx, slides 1 à 55 ; exemples de publications et checklist réseaux sociaux en trois volets.</w:t>
             </w:r>
           </w:p>
         </w:tc>

</xml_diff>